<commit_message>
Restructure proforma cheat sheet: market first, vendor services by type
Combine payroll and owner into employee structure, move market ahead of
events and revenue, section vendor services by type, add the ideal
new-market venue profile, fold the owner question into payroll.

Co-Authored-By: Claude Fable 5.1 <noreply@anthropic.com>
Claude-Session: https://claude.ai/code/session_01H1o2hAHLKnaHhCBRW9ndXv
</commit_message>
<xml_diff>
--- a/docs/proforma-cheatsheet/Pre-LOI Proforma Cheat Sheet.docx
+++ b/docs/proforma-cheatsheet/Pre-LOI Proforma Cheat Sheet.docx
@@ -97,7 +97,7 @@
           <w:sz w:val="18"/>
           <w:szCs w:val="18"/>
         </w:rPr>
-        <w:t xml:space="preserve">Five questions that set the tone for every proforma</w:t>
+        <w:t xml:space="preserve">Four questions that set the tone for every proforma</w:t>
       </w:r>
     </w:p>
     <w:tbl>
@@ -113,16 +113,15 @@
         </w:tblBorders>
       </w:tblPr>
       <w:tblGrid>
-        <w:gridCol w:w="2102"/>
-        <w:gridCol w:w="2102"/>
-        <w:gridCol w:w="2102"/>
-        <w:gridCol w:w="2102"/>
-        <w:gridCol w:w="2104"/>
+        <w:gridCol w:w="2628"/>
+        <w:gridCol w:w="2628"/>
+        <w:gridCol w:w="2628"/>
+        <w:gridCol w:w="2628"/>
       </w:tblGrid>
       <w:tr>
         <w:tc>
           <w:tcPr>
-            <w:tcW w:type="dxa" w:w="2102"/>
+            <w:tcW w:type="dxa" w:w="2628"/>
             <w:tcBorders>
               <w:top w:val="single" w:color="FFFFFF" w:sz="24"/>
               <w:left w:val="single" w:color="FFFFFF" w:sz="24"/>
@@ -150,8 +149,8 @@
                 <w:i w:val="false"/>
                 <w:iCs w:val="false"/>
                 <w:color w:val="2A78D6"/>
-                <w:sz w:val="20"/>
-                <w:szCs w:val="20"/>
+                <w:sz w:val="21"/>
+                <w:szCs w:val="21"/>
               </w:rPr>
               <w:t xml:space="preserve">Performing or growth?</w:t>
             </w:r>
@@ -216,7 +215,7 @@
         </w:tc>
         <w:tc>
           <w:tcPr>
-            <w:tcW w:type="dxa" w:w="2102"/>
+            <w:tcW w:type="dxa" w:w="2628"/>
             <w:tcBorders>
               <w:top w:val="single" w:color="FFFFFF" w:sz="24"/>
               <w:left w:val="single" w:color="FFFFFF" w:sz="24"/>
@@ -244,8 +243,8 @@
                 <w:i w:val="false"/>
                 <w:iCs w:val="false"/>
                 <w:color w:val="2A78D6"/>
-                <w:sz w:val="20"/>
-                <w:szCs w:val="20"/>
+                <w:sz w:val="21"/>
+                <w:szCs w:val="21"/>
               </w:rPr>
               <w:t xml:space="preserve">Vendor services</w:t>
             </w:r>
@@ -266,7 +265,7 @@
                 <w:sz w:val="18"/>
                 <w:szCs w:val="18"/>
               </w:rPr>
-              <w:t xml:space="preserve">What they do today</w:t>
+              <w:t xml:space="preserve">What they do today vs. what we implement, and how fast</w:t>
             </w:r>
           </w:p>
           <w:p>
@@ -285,7 +284,44 @@
                 <w:sz w:val="18"/>
                 <w:szCs w:val="18"/>
               </w:rPr>
-              <w:t xml:space="preserve">vs. what we implement,</w:t>
+              <w:t xml:space="preserve">Plus our marketing to fill events</w:t>
+            </w:r>
+          </w:p>
+        </w:tc>
+        <w:tc>
+          <w:tcPr>
+            <w:tcW w:type="dxa" w:w="2628"/>
+            <w:tcBorders>
+              <w:top w:val="single" w:color="FFFFFF" w:sz="24"/>
+              <w:left w:val="single" w:color="FFFFFF" w:sz="24"/>
+              <w:bottom w:val="single" w:color="FFFFFF" w:sz="24"/>
+              <w:right w:val="single" w:color="FFFFFF" w:sz="24"/>
+            </w:tcBorders>
+            <w:shd w:fill="EEF2F8" w:color="auto" w:val="clear"/>
+            <w:tcMar>
+              <w:top w:type="dxa" w:w="120"/>
+              <w:left w:type="dxa" w:w="140"/>
+              <w:bottom w:type="dxa" w:w="120"/>
+              <w:right w:type="dxa" w:w="140"/>
+            </w:tcMar>
+          </w:tcPr>
+          <w:p>
+            <w:pPr>
+              <w:spacing w:after="60" w:before="0" w:line="264"/>
+              <w:jc w:val="left"/>
+            </w:pPr>
+            <w:r>
+              <w:rPr>
+                <w:rFonts w:ascii="Calibri" w:cs="Calibri" w:eastAsia="Calibri" w:hAnsi="Calibri"/>
+                <w:b/>
+                <w:bCs/>
+                <w:i w:val="false"/>
+                <w:iCs w:val="false"/>
+                <w:color w:val="2A78D6"/>
+                <w:sz w:val="21"/>
+                <w:szCs w:val="21"/>
+              </w:rPr>
+              <w:t xml:space="preserve">Employee structure</w:t>
             </w:r>
           </w:p>
           <w:p>
@@ -304,44 +340,7 @@
                 <w:sz w:val="18"/>
                 <w:szCs w:val="18"/>
               </w:rPr>
-              <w:t xml:space="preserve">and how fast</w:t>
-            </w:r>
-          </w:p>
-        </w:tc>
-        <w:tc>
-          <w:tcPr>
-            <w:tcW w:type="dxa" w:w="2102"/>
-            <w:tcBorders>
-              <w:top w:val="single" w:color="FFFFFF" w:sz="24"/>
-              <w:left w:val="single" w:color="FFFFFF" w:sz="24"/>
-              <w:bottom w:val="single" w:color="FFFFFF" w:sz="24"/>
-              <w:right w:val="single" w:color="FFFFFF" w:sz="24"/>
-            </w:tcBorders>
-            <w:shd w:fill="EEF2F8" w:color="auto" w:val="clear"/>
-            <w:tcMar>
-              <w:top w:type="dxa" w:w="120"/>
-              <w:left w:type="dxa" w:w="140"/>
-              <w:bottom w:type="dxa" w:w="120"/>
-              <w:right w:type="dxa" w:w="140"/>
-            </w:tcMar>
-          </w:tcPr>
-          <w:p>
-            <w:pPr>
-              <w:spacing w:after="60" w:before="0" w:line="264"/>
-              <w:jc w:val="left"/>
-            </w:pPr>
-            <w:r>
-              <w:rPr>
-                <w:rFonts w:ascii="Calibri" w:cs="Calibri" w:eastAsia="Calibri" w:hAnsi="Calibri"/>
-                <w:b/>
-                <w:bCs/>
-                <w:i w:val="false"/>
-                <w:iCs w:val="false"/>
-                <w:color w:val="2A78D6"/>
-                <w:sz w:val="20"/>
-                <w:szCs w:val="20"/>
-              </w:rPr>
-              <w:t xml:space="preserve">Payroll</w:t>
+              <w:t xml:space="preserve">Overstaffed or understaffed?</w:t>
             </w:r>
           </w:p>
           <w:p>
@@ -360,7 +359,44 @@
                 <w:sz w:val="18"/>
                 <w:szCs w:val="18"/>
               </w:rPr>
-              <w:t xml:space="preserve">Overstaffed</w:t>
+              <w:t xml:space="preserve">Owner heavily involved or hands-off?</w:t>
+            </w:r>
+          </w:p>
+        </w:tc>
+        <w:tc>
+          <w:tcPr>
+            <w:tcW w:type="dxa" w:w="2628"/>
+            <w:tcBorders>
+              <w:top w:val="single" w:color="FFFFFF" w:sz="24"/>
+              <w:left w:val="single" w:color="FFFFFF" w:sz="24"/>
+              <w:bottom w:val="single" w:color="FFFFFF" w:sz="24"/>
+              <w:right w:val="single" w:color="FFFFFF" w:sz="24"/>
+            </w:tcBorders>
+            <w:shd w:fill="EEF2F8" w:color="auto" w:val="clear"/>
+            <w:tcMar>
+              <w:top w:type="dxa" w:w="120"/>
+              <w:left w:type="dxa" w:w="140"/>
+              <w:bottom w:type="dxa" w:w="120"/>
+              <w:right w:type="dxa" w:w="140"/>
+            </w:tcMar>
+          </w:tcPr>
+          <w:p>
+            <w:pPr>
+              <w:spacing w:after="60" w:before="0" w:line="264"/>
+              <w:jc w:val="left"/>
+            </w:pPr>
+            <w:r>
+              <w:rPr>
+                <w:rFonts w:ascii="Calibri" w:cs="Calibri" w:eastAsia="Calibri" w:hAnsi="Calibri"/>
+                <w:b/>
+                <w:bCs/>
+                <w:i w:val="false"/>
+                <w:iCs w:val="false"/>
+                <w:color w:val="2A78D6"/>
+                <w:sz w:val="21"/>
+                <w:szCs w:val="21"/>
+              </w:rPr>
+              <w:t xml:space="preserve">Market</w:t>
             </w:r>
           </w:p>
           <w:p>
@@ -379,7 +415,7 @@
                 <w:sz w:val="18"/>
                 <w:szCs w:val="18"/>
               </w:rPr>
-              <w:t xml:space="preserve">— or —</w:t>
+              <w:t xml:space="preserve">Current market</w:t>
             </w:r>
           </w:p>
           <w:p>
@@ -398,44 +434,7 @@
                 <w:sz w:val="18"/>
                 <w:szCs w:val="18"/>
               </w:rPr>
-              <w:t xml:space="preserve">Understaffed</w:t>
-            </w:r>
-          </w:p>
-        </w:tc>
-        <w:tc>
-          <w:tcPr>
-            <w:tcW w:type="dxa" w:w="2102"/>
-            <w:tcBorders>
-              <w:top w:val="single" w:color="FFFFFF" w:sz="24"/>
-              <w:left w:val="single" w:color="FFFFFF" w:sz="24"/>
-              <w:bottom w:val="single" w:color="FFFFFF" w:sz="24"/>
-              <w:right w:val="single" w:color="FFFFFF" w:sz="24"/>
-            </w:tcBorders>
-            <w:shd w:fill="EEF2F8" w:color="auto" w:val="clear"/>
-            <w:tcMar>
-              <w:top w:type="dxa" w:w="120"/>
-              <w:left w:type="dxa" w:w="140"/>
-              <w:bottom w:type="dxa" w:w="120"/>
-              <w:right w:type="dxa" w:w="140"/>
-            </w:tcMar>
-          </w:tcPr>
-          <w:p>
-            <w:pPr>
-              <w:spacing w:after="60" w:before="0" w:line="264"/>
-              <w:jc w:val="left"/>
-            </w:pPr>
-            <w:r>
-              <w:rPr>
-                <w:rFonts w:ascii="Calibri" w:cs="Calibri" w:eastAsia="Calibri" w:hAnsi="Calibri"/>
-                <w:b/>
-                <w:bCs/>
-                <w:i w:val="false"/>
-                <w:iCs w:val="false"/>
-                <w:color w:val="2A78D6"/>
-                <w:sz w:val="20"/>
-                <w:szCs w:val="20"/>
-              </w:rPr>
-              <w:t xml:space="preserve">Owner</w:t>
+              <w:t xml:space="preserve">— or —</w:t>
             </w:r>
           </w:p>
           <w:p>
@@ -454,168 +453,12 @@
                 <w:sz w:val="18"/>
                 <w:szCs w:val="18"/>
               </w:rPr>
-              <w:t xml:space="preserve">Heavily involved</w:t>
-            </w:r>
-          </w:p>
-          <w:p>
-            <w:pPr>
-              <w:spacing w:after="30" w:before="0" w:line="240"/>
-              <w:jc w:val="left"/>
-            </w:pPr>
-            <w:r>
-              <w:rPr>
-                <w:rFonts w:ascii="Calibri" w:cs="Calibri" w:eastAsia="Calibri" w:hAnsi="Calibri"/>
-                <w:b w:val="false"/>
-                <w:bCs w:val="false"/>
-                <w:i w:val="false"/>
-                <w:iCs w:val="false"/>
-                <w:color w:val="52514E"/>
-                <w:sz w:val="18"/>
-                <w:szCs w:val="18"/>
-              </w:rPr>
-              <w:t xml:space="preserve">— or —</w:t>
-            </w:r>
-          </w:p>
-          <w:p>
-            <w:pPr>
-              <w:spacing w:after="30" w:before="0" w:line="240"/>
-              <w:jc w:val="left"/>
-            </w:pPr>
-            <w:r>
-              <w:rPr>
-                <w:rFonts w:ascii="Calibri" w:cs="Calibri" w:eastAsia="Calibri" w:hAnsi="Calibri"/>
-                <w:b w:val="false"/>
-                <w:bCs w:val="false"/>
-                <w:i w:val="false"/>
-                <w:iCs w:val="false"/>
-                <w:color w:val="52514E"/>
-                <w:sz w:val="18"/>
-                <w:szCs w:val="18"/>
-              </w:rPr>
-              <w:t xml:space="preserve">Hands-off</w:t>
-            </w:r>
-          </w:p>
-        </w:tc>
-        <w:tc>
-          <w:tcPr>
-            <w:tcW w:type="dxa" w:w="2104"/>
-            <w:tcBorders>
-              <w:top w:val="single" w:color="FFFFFF" w:sz="24"/>
-              <w:left w:val="single" w:color="FFFFFF" w:sz="24"/>
-              <w:bottom w:val="single" w:color="FFFFFF" w:sz="24"/>
-              <w:right w:val="single" w:color="FFFFFF" w:sz="24"/>
-            </w:tcBorders>
-            <w:shd w:fill="EEF2F8" w:color="auto" w:val="clear"/>
-            <w:tcMar>
-              <w:top w:type="dxa" w:w="120"/>
-              <w:left w:type="dxa" w:w="140"/>
-              <w:bottom w:type="dxa" w:w="120"/>
-              <w:right w:type="dxa" w:w="140"/>
-            </w:tcMar>
-          </w:tcPr>
-          <w:p>
-            <w:pPr>
-              <w:spacing w:after="60" w:before="0" w:line="264"/>
-              <w:jc w:val="left"/>
-            </w:pPr>
-            <w:r>
-              <w:rPr>
-                <w:rFonts w:ascii="Calibri" w:cs="Calibri" w:eastAsia="Calibri" w:hAnsi="Calibri"/>
-                <w:b/>
-                <w:bCs/>
-                <w:i w:val="false"/>
-                <w:iCs w:val="false"/>
-                <w:color w:val="2A78D6"/>
-                <w:sz w:val="20"/>
-                <w:szCs w:val="20"/>
-              </w:rPr>
-              <w:t xml:space="preserve">Market</w:t>
-            </w:r>
-          </w:p>
-          <w:p>
-            <w:pPr>
-              <w:spacing w:after="30" w:before="0" w:line="240"/>
-              <w:jc w:val="left"/>
-            </w:pPr>
-            <w:r>
-              <w:rPr>
-                <w:rFonts w:ascii="Calibri" w:cs="Calibri" w:eastAsia="Calibri" w:hAnsi="Calibri"/>
-                <w:b w:val="false"/>
-                <w:bCs w:val="false"/>
-                <w:i w:val="false"/>
-                <w:iCs w:val="false"/>
-                <w:color w:val="52514E"/>
-                <w:sz w:val="18"/>
-                <w:szCs w:val="18"/>
-              </w:rPr>
-              <w:t xml:space="preserve">Current market</w:t>
-            </w:r>
-          </w:p>
-          <w:p>
-            <w:pPr>
-              <w:spacing w:after="30" w:before="0" w:line="240"/>
-              <w:jc w:val="left"/>
-            </w:pPr>
-            <w:r>
-              <w:rPr>
-                <w:rFonts w:ascii="Calibri" w:cs="Calibri" w:eastAsia="Calibri" w:hAnsi="Calibri"/>
-                <w:b w:val="false"/>
-                <w:bCs w:val="false"/>
-                <w:i w:val="false"/>
-                <w:iCs w:val="false"/>
-                <w:color w:val="52514E"/>
-                <w:sz w:val="18"/>
-                <w:szCs w:val="18"/>
-              </w:rPr>
-              <w:t xml:space="preserve">— or —</w:t>
-            </w:r>
-          </w:p>
-          <w:p>
-            <w:pPr>
-              <w:spacing w:after="30" w:before="0" w:line="240"/>
-              <w:jc w:val="left"/>
-            </w:pPr>
-            <w:r>
-              <w:rPr>
-                <w:rFonts w:ascii="Calibri" w:cs="Calibri" w:eastAsia="Calibri" w:hAnsi="Calibri"/>
-                <w:b w:val="false"/>
-                <w:bCs w:val="false"/>
-                <w:i w:val="false"/>
-                <w:iCs w:val="false"/>
-                <w:color w:val="52514E"/>
-                <w:sz w:val="18"/>
-                <w:szCs w:val="18"/>
-              </w:rPr>
               <w:t xml:space="preserve">New market</w:t>
             </w:r>
           </w:p>
         </w:tc>
       </w:tr>
     </w:tbl>
-    <w:p>
-      <w:pPr>
-        <w:spacing w:after="60" w:before="0"/>
-      </w:pPr>
-    </w:p>
-    <w:p>
-      <w:pPr>
-        <w:spacing w:after="60" w:before="0" w:line="264"/>
-        <w:jc w:val="left"/>
-      </w:pPr>
-      <w:r>
-        <w:rPr>
-          <w:rFonts w:ascii="Calibri" w:cs="Calibri" w:eastAsia="Calibri" w:hAnsi="Calibri"/>
-          <w:b w:val="false"/>
-          <w:bCs w:val="false"/>
-          <w:i/>
-          <w:iCs/>
-          <w:color w:val="52514E"/>
-          <w:sz w:val="18"/>
-          <w:szCs w:val="18"/>
-        </w:rPr>
-        <w:t xml:space="preserve">Also: our marketing to get events booked, not just vendor services.</w:t>
-      </w:r>
-    </w:p>
     <w:p>
       <w:pPr>
         <w:pStyle w:val="Heading1"/>
@@ -930,6 +773,11 @@
       </w:tr>
     </w:tbl>
     <w:p>
+      <w:r>
+        <w:br w:type="page"/>
+      </w:r>
+    </w:p>
+    <w:p>
       <w:pPr>
         <w:pStyle w:val="Heading1"/>
         <w:pBdr>
@@ -948,7 +796,551 @@
           <w:sz w:val="30"/>
           <w:szCs w:val="30"/>
         </w:rPr>
-        <w:t xml:space="preserve">3. Events — the three numbers</w:t>
+        <w:t xml:space="preserve">3. Current vs. new market</w:t>
+      </w:r>
+    </w:p>
+    <w:p>
+      <w:pPr>
+        <w:spacing w:after="100" w:before="0" w:line="264"/>
+        <w:jc w:val="left"/>
+      </w:pPr>
+      <w:r>
+        <w:rPr>
+          <w:rFonts w:ascii="Calibri" w:cs="Calibri" w:eastAsia="Calibri" w:hAnsi="Calibri"/>
+          <w:b w:val="false"/>
+          <w:bCs w:val="false"/>
+          <w:i/>
+          <w:iCs/>
+          <w:color w:val="52514E"/>
+          <w:sz w:val="18"/>
+          <w:szCs w:val="18"/>
+        </w:rPr>
+        <w:t xml:space="preserve">Current market = within 90 minutes of our hubs</w:t>
+      </w:r>
+    </w:p>
+    <w:p>
+      <w:pPr>
+        <w:spacing w:after="60" w:before="60"/>
+        <w:jc w:val="center"/>
+      </w:pPr>
+      <w:r>
+        <w:drawing>
+          <wp:inline distT="0" distB="0" distL="0" distR="0">
+            <wp:extent cx="5305425" cy="1943100"/>
+            <wp:effectExtent t="0" r="0" b="0" l="0"/>
+            <wp:docPr id="1" name="" descr="" title=""/>
+            <wp:cNvGraphicFramePr>
+              <a:graphicFrameLocks xmlns:a="http://schemas.openxmlformats.org/drawingml/2006/main" noChangeAspect="1"/>
+            </wp:cNvGraphicFramePr>
+            <a:graphic xmlns:a="http://schemas.openxmlformats.org/drawingml/2006/main">
+              <a:graphicData uri="http://schemas.openxmlformats.org/drawingml/2006/picture">
+                <pic:pic xmlns:pic="http://schemas.openxmlformats.org/drawingml/2006/picture">
+                  <pic:nvPicPr>
+                    <pic:cNvPr id="0" name="" descr=""/>
+                    <pic:cNvPicPr>
+                      <a:picLocks noChangeAspect="1" noChangeArrowheads="1"/>
+                    </pic:cNvPicPr>
+                  </pic:nvPicPr>
+                  <pic:blipFill>
+                    <a:blip r:embed="rId8" cstate="none"/>
+                    <a:srcRect/>
+                    <a:stretch>
+                      <a:fillRect/>
+                    </a:stretch>
+                  </pic:blipFill>
+                  <pic:spPr bwMode="auto">
+                    <a:xfrm>
+                      <a:off x="0" y="0"/>
+                      <a:ext cx="5305425" cy="1943100"/>
+                    </a:xfrm>
+                    <a:prstGeom prst="rect">
+                      <a:avLst/>
+                    </a:prstGeom>
+                  </pic:spPr>
+                </pic:pic>
+              </a:graphicData>
+            </a:graphic>
+          </wp:inline>
+        </w:drawing>
+      </w:r>
+    </w:p>
+    <w:tbl>
+      <w:tblPr>
+        <w:tblW w:type="dxa" w:w="10512"/>
+        <w:tblBorders>
+          <w:top w:val="none" w:color="FFFFFF" w:sz="0"/>
+          <w:left w:val="none" w:color="FFFFFF" w:sz="0"/>
+          <w:bottom w:val="none" w:color="FFFFFF" w:sz="0"/>
+          <w:right w:val="none" w:color="FFFFFF" w:sz="0"/>
+          <w:insideH w:val="single" w:color="auto" w:sz="4"/>
+          <w:insideV w:val="single" w:color="auto" w:sz="4"/>
+        </w:tblBorders>
+      </w:tblPr>
+      <w:tblGrid>
+        <w:gridCol w:w="2700"/>
+        <w:gridCol w:w="7812"/>
+      </w:tblGrid>
+      <w:tr>
+        <w:tc>
+          <w:tcPr>
+            <w:tcW w:type="dxa" w:w="2700"/>
+            <w:tcBorders>
+              <w:top w:val="single" w:color="FFFFFF" w:sz="24"/>
+              <w:left w:val="single" w:color="FFFFFF" w:sz="24"/>
+              <w:bottom w:val="single" w:color="FFFFFF" w:sz="24"/>
+              <w:right w:val="single" w:color="FFFFFF" w:sz="24"/>
+            </w:tcBorders>
+            <w:shd w:fill="EEF2F8" w:color="auto" w:val="clear"/>
+            <w:tcMar>
+              <w:top w:type="dxa" w:w="80"/>
+              <w:left w:type="dxa" w:w="140"/>
+              <w:bottom w:type="dxa" w:w="80"/>
+              <w:right w:type="dxa" w:w="140"/>
+            </w:tcMar>
+          </w:tcPr>
+          <w:p>
+            <w:pPr>
+              <w:spacing w:after="0" w:before="0" w:line="264"/>
+              <w:jc w:val="left"/>
+            </w:pPr>
+            <w:r>
+              <w:rPr>
+                <w:rFonts w:ascii="Calibri" w:cs="Calibri" w:eastAsia="Calibri" w:hAnsi="Calibri"/>
+                <w:b/>
+                <w:bCs/>
+                <w:i w:val="false"/>
+                <w:iCs w:val="false"/>
+                <w:color w:val="2A78D6"/>
+                <w:sz w:val="20"/>
+                <w:szCs w:val="20"/>
+              </w:rPr>
+              <w:t xml:space="preserve">Dallas hubs</w:t>
+            </w:r>
+          </w:p>
+        </w:tc>
+        <w:tc>
+          <w:tcPr>
+            <w:tcW w:type="dxa" w:w="7812"/>
+            <w:tcBorders>
+              <w:top w:val="single" w:color="FFFFFF" w:sz="24"/>
+              <w:left w:val="single" w:color="FFFFFF" w:sz="24"/>
+              <w:bottom w:val="single" w:color="FFFFFF" w:sz="24"/>
+              <w:right w:val="single" w:color="FFFFFF" w:sz="24"/>
+            </w:tcBorders>
+            <w:shd w:fill="F7F7F5" w:color="auto" w:val="clear"/>
+            <w:tcMar>
+              <w:top w:type="dxa" w:w="80"/>
+              <w:left w:type="dxa" w:w="140"/>
+              <w:bottom w:type="dxa" w:w="80"/>
+              <w:right w:type="dxa" w:w="140"/>
+            </w:tcMar>
+          </w:tcPr>
+          <w:p>
+            <w:pPr>
+              <w:spacing w:after="0" w:before="0" w:line="264"/>
+              <w:jc w:val="left"/>
+            </w:pPr>
+            <w:r>
+              <w:rPr>
+                <w:rFonts w:ascii="Calibri" w:cs="Calibri" w:eastAsia="Calibri" w:hAnsi="Calibri"/>
+                <w:b w:val="false"/>
+                <w:bCs w:val="false"/>
+                <w:i w:val="false"/>
+                <w:iCs w:val="false"/>
+                <w:color w:val="0B0B0B"/>
+                <w:sz w:val="20"/>
+                <w:szCs w:val="20"/>
+              </w:rPr>
+              <w:t xml:space="preserve">The Olana (bakery + floral) · one of our three catering hubs, whichever is closest</w:t>
+            </w:r>
+          </w:p>
+        </w:tc>
+      </w:tr>
+      <w:tr>
+        <w:tc>
+          <w:tcPr>
+            <w:tcW w:type="dxa" w:w="2700"/>
+            <w:tcBorders>
+              <w:top w:val="single" w:color="FFFFFF" w:sz="24"/>
+              <w:left w:val="single" w:color="FFFFFF" w:sz="24"/>
+              <w:bottom w:val="single" w:color="FFFFFF" w:sz="24"/>
+              <w:right w:val="single" w:color="FFFFFF" w:sz="24"/>
+            </w:tcBorders>
+            <w:shd w:fill="EEF2F8" w:color="auto" w:val="clear"/>
+            <w:tcMar>
+              <w:top w:type="dxa" w:w="80"/>
+              <w:left w:type="dxa" w:w="140"/>
+              <w:bottom w:type="dxa" w:w="80"/>
+              <w:right w:type="dxa" w:w="140"/>
+            </w:tcMar>
+          </w:tcPr>
+          <w:p>
+            <w:pPr>
+              <w:spacing w:after="0" w:before="0" w:line="264"/>
+              <w:jc w:val="left"/>
+            </w:pPr>
+            <w:r>
+              <w:rPr>
+                <w:rFonts w:ascii="Calibri" w:cs="Calibri" w:eastAsia="Calibri" w:hAnsi="Calibri"/>
+                <w:b/>
+                <w:bCs/>
+                <w:i w:val="false"/>
+                <w:iCs w:val="false"/>
+                <w:color w:val="2A78D6"/>
+                <w:sz w:val="20"/>
+                <w:szCs w:val="20"/>
+              </w:rPr>
+              <w:t xml:space="preserve">Rule</w:t>
+            </w:r>
+          </w:p>
+        </w:tc>
+        <w:tc>
+          <w:tcPr>
+            <w:tcW w:type="dxa" w:w="7812"/>
+            <w:tcBorders>
+              <w:top w:val="single" w:color="FFFFFF" w:sz="24"/>
+              <w:left w:val="single" w:color="FFFFFF" w:sz="24"/>
+              <w:bottom w:val="single" w:color="FFFFFF" w:sz="24"/>
+              <w:right w:val="single" w:color="FFFFFF" w:sz="24"/>
+            </w:tcBorders>
+            <w:shd w:fill="F7F7F5" w:color="auto" w:val="clear"/>
+            <w:tcMar>
+              <w:top w:type="dxa" w:w="80"/>
+              <w:left w:type="dxa" w:w="140"/>
+              <w:bottom w:type="dxa" w:w="80"/>
+              <w:right w:type="dxa" w:w="140"/>
+            </w:tcMar>
+          </w:tcPr>
+          <w:p>
+            <w:pPr>
+              <w:spacing w:after="0" w:before="0" w:line="264"/>
+              <w:jc w:val="left"/>
+            </w:pPr>
+            <w:r>
+              <w:rPr>
+                <w:rFonts w:ascii="Calibri" w:cs="Calibri" w:eastAsia="Calibri" w:hAnsi="Calibri"/>
+                <w:b w:val="false"/>
+                <w:bCs w:val="false"/>
+                <w:i w:val="false"/>
+                <w:iCs w:val="false"/>
+                <w:color w:val="0B0B0B"/>
+                <w:sz w:val="20"/>
+                <w:szCs w:val="20"/>
+              </w:rPr>
+              <w:t xml:space="preserve">Model each vendor service against its own hub. 30 min from catering but 1–2 hrs from bakery → catering yes, bakery $0.</w:t>
+            </w:r>
+          </w:p>
+        </w:tc>
+      </w:tr>
+      <w:tr>
+        <w:tc>
+          <w:tcPr>
+            <w:tcW w:type="dxa" w:w="2700"/>
+            <w:tcBorders>
+              <w:top w:val="single" w:color="FFFFFF" w:sz="24"/>
+              <w:left w:val="single" w:color="FFFFFF" w:sz="24"/>
+              <w:bottom w:val="single" w:color="FFFFFF" w:sz="24"/>
+              <w:right w:val="single" w:color="FFFFFF" w:sz="24"/>
+            </w:tcBorders>
+            <w:shd w:fill="EEF2F8" w:color="auto" w:val="clear"/>
+            <w:tcMar>
+              <w:top w:type="dxa" w:w="80"/>
+              <w:left w:type="dxa" w:w="140"/>
+              <w:bottom w:type="dxa" w:w="80"/>
+              <w:right w:type="dxa" w:w="140"/>
+            </w:tcMar>
+          </w:tcPr>
+          <w:p>
+            <w:pPr>
+              <w:spacing w:after="0" w:before="0" w:line="264"/>
+              <w:jc w:val="left"/>
+            </w:pPr>
+            <w:r>
+              <w:rPr>
+                <w:rFonts w:ascii="Calibri" w:cs="Calibri" w:eastAsia="Calibri" w:hAnsi="Calibri"/>
+                <w:b/>
+                <w:bCs/>
+                <w:i w:val="false"/>
+                <w:iCs w:val="false"/>
+                <w:color w:val="2A78D6"/>
+                <w:sz w:val="20"/>
+                <w:szCs w:val="20"/>
+              </w:rPr>
+              <w:t xml:space="preserve">New market</w:t>
+            </w:r>
+          </w:p>
+        </w:tc>
+        <w:tc>
+          <w:tcPr>
+            <w:tcW w:type="dxa" w:w="7812"/>
+            <w:tcBorders>
+              <w:top w:val="single" w:color="FFFFFF" w:sz="24"/>
+              <w:left w:val="single" w:color="FFFFFF" w:sz="24"/>
+              <w:bottom w:val="single" w:color="FFFFFF" w:sz="24"/>
+              <w:right w:val="single" w:color="FFFFFF" w:sz="24"/>
+            </w:tcBorders>
+            <w:shd w:fill="F7F7F5" w:color="auto" w:val="clear"/>
+            <w:tcMar>
+              <w:top w:type="dxa" w:w="80"/>
+              <w:left w:type="dxa" w:w="140"/>
+              <w:bottom w:type="dxa" w:w="80"/>
+              <w:right w:type="dxa" w:w="140"/>
+            </w:tcMar>
+          </w:tcPr>
+          <w:p>
+            <w:pPr>
+              <w:spacing w:after="0" w:before="0" w:line="264"/>
+              <w:jc w:val="left"/>
+            </w:pPr>
+            <w:r>
+              <w:rPr>
+                <w:rFonts w:ascii="Calibri" w:cs="Calibri" w:eastAsia="Calibri" w:hAnsi="Calibri"/>
+                <w:b w:val="false"/>
+                <w:bCs w:val="false"/>
+                <w:i w:val="false"/>
+                <w:iCs w:val="false"/>
+                <w:color w:val="0B0B0B"/>
+                <w:sz w:val="20"/>
+                <w:szCs w:val="20"/>
+              </w:rPr>
+              <w:t xml:space="preserve">Think further out. The venue must do well on its own; vendor services may not come for a couple of years, once volume exists.</w:t>
+            </w:r>
+          </w:p>
+        </w:tc>
+      </w:tr>
+    </w:tbl>
+    <w:p>
+      <w:pPr>
+        <w:spacing w:after="80" w:before="0"/>
+      </w:pPr>
+    </w:p>
+    <w:p>
+      <w:pPr>
+        <w:spacing w:after="40" w:before="0" w:line="264"/>
+        <w:jc w:val="left"/>
+      </w:pPr>
+      <w:r>
+        <w:rPr>
+          <w:rFonts w:ascii="Calibri" w:cs="Calibri" w:eastAsia="Calibri" w:hAnsi="Calibri"/>
+          <w:b/>
+          <w:bCs/>
+          <w:i w:val="false"/>
+          <w:iCs w:val="false"/>
+          <w:color w:val="0B0B0B"/>
+          <w:sz w:val="20"/>
+          <w:szCs w:val="20"/>
+        </w:rPr>
+        <w:t xml:space="preserve">The perfect new-market venue</w:t>
+      </w:r>
+    </w:p>
+    <w:tbl>
+      <w:tblPr>
+        <w:tblW w:type="dxa" w:w="10512"/>
+        <w:tblBorders>
+          <w:top w:val="none" w:color="FFFFFF" w:sz="0"/>
+          <w:left w:val="none" w:color="FFFFFF" w:sz="0"/>
+          <w:bottom w:val="none" w:color="FFFFFF" w:sz="0"/>
+          <w:right w:val="none" w:color="FFFFFF" w:sz="0"/>
+          <w:insideH w:val="single" w:color="auto" w:sz="4"/>
+          <w:insideV w:val="single" w:color="auto" w:sz="4"/>
+        </w:tblBorders>
+      </w:tblPr>
+      <w:tblGrid>
+        <w:gridCol w:w="3504"/>
+        <w:gridCol w:w="3504"/>
+        <w:gridCol w:w="3504"/>
+      </w:tblGrid>
+      <w:tr>
+        <w:tc>
+          <w:tcPr>
+            <w:tcW w:type="dxa" w:w="3504"/>
+            <w:tcBorders>
+              <w:top w:val="single" w:color="FFFFFF" w:sz="24"/>
+              <w:left w:val="single" w:color="FFFFFF" w:sz="24"/>
+              <w:bottom w:val="single" w:color="FFFFFF" w:sz="24"/>
+              <w:right w:val="single" w:color="FFFFFF" w:sz="24"/>
+            </w:tcBorders>
+            <w:shd w:fill="EEF2F8" w:color="auto" w:val="clear"/>
+            <w:tcMar>
+              <w:top w:type="dxa" w:w="120"/>
+              <w:left w:type="dxa" w:w="140"/>
+              <w:bottom w:type="dxa" w:w="120"/>
+              <w:right w:type="dxa" w:w="140"/>
+            </w:tcMar>
+          </w:tcPr>
+          <w:p>
+            <w:pPr>
+              <w:spacing w:after="60" w:before="0" w:line="264"/>
+              <w:jc w:val="left"/>
+            </w:pPr>
+            <w:r>
+              <w:rPr>
+                <w:rFonts w:ascii="Calibri" w:cs="Calibri" w:eastAsia="Calibri" w:hAnsi="Calibri"/>
+                <w:b/>
+                <w:bCs/>
+                <w:i w:val="false"/>
+                <w:iCs w:val="false"/>
+                <w:color w:val="2A78D6"/>
+                <w:sz w:val="21"/>
+                <w:szCs w:val="21"/>
+              </w:rPr>
+              <w:t xml:space="preserve">~100 events / year</w:t>
+            </w:r>
+          </w:p>
+          <w:p>
+            <w:pPr>
+              <w:spacing w:after="30" w:before="0" w:line="240"/>
+              <w:jc w:val="left"/>
+            </w:pPr>
+            <w:r>
+              <w:rPr>
+                <w:rFonts w:ascii="Calibri" w:cs="Calibri" w:eastAsia="Calibri" w:hAnsi="Calibri"/>
+                <w:b w:val="false"/>
+                <w:bCs w:val="false"/>
+                <w:i w:val="false"/>
+                <w:iCs w:val="false"/>
+                <w:color w:val="52514E"/>
+                <w:sz w:val="18"/>
+                <w:szCs w:val="18"/>
+              </w:rPr>
+              <w:t xml:space="preserve">Real volume from day one</w:t>
+            </w:r>
+          </w:p>
+        </w:tc>
+        <w:tc>
+          <w:tcPr>
+            <w:tcW w:type="dxa" w:w="3504"/>
+            <w:tcBorders>
+              <w:top w:val="single" w:color="FFFFFF" w:sz="24"/>
+              <w:left w:val="single" w:color="FFFFFF" w:sz="24"/>
+              <w:bottom w:val="single" w:color="FFFFFF" w:sz="24"/>
+              <w:right w:val="single" w:color="FFFFFF" w:sz="24"/>
+            </w:tcBorders>
+            <w:shd w:fill="EEF2F8" w:color="auto" w:val="clear"/>
+            <w:tcMar>
+              <w:top w:type="dxa" w:w="120"/>
+              <w:left w:type="dxa" w:w="140"/>
+              <w:bottom w:type="dxa" w:w="120"/>
+              <w:right w:type="dxa" w:w="140"/>
+            </w:tcMar>
+          </w:tcPr>
+          <w:p>
+            <w:pPr>
+              <w:spacing w:after="60" w:before="0" w:line="264"/>
+              <w:jc w:val="left"/>
+            </w:pPr>
+            <w:r>
+              <w:rPr>
+                <w:rFonts w:ascii="Calibri" w:cs="Calibri" w:eastAsia="Calibri" w:hAnsi="Calibri"/>
+                <w:b/>
+                <w:bCs/>
+                <w:i w:val="false"/>
+                <w:iCs w:val="false"/>
+                <w:color w:val="2A78D6"/>
+                <w:sz w:val="21"/>
+                <w:szCs w:val="21"/>
+              </w:rPr>
+              <w:t xml:space="preserve">All-inclusive package</w:t>
+            </w:r>
+          </w:p>
+          <w:p>
+            <w:pPr>
+              <w:spacing w:after="30" w:before="0" w:line="240"/>
+              <w:jc w:val="left"/>
+            </w:pPr>
+            <w:r>
+              <w:rPr>
+                <w:rFonts w:ascii="Calibri" w:cs="Calibri" w:eastAsia="Calibri" w:hAnsi="Calibri"/>
+                <w:b w:val="false"/>
+                <w:bCs w:val="false"/>
+                <w:i w:val="false"/>
+                <w:iCs w:val="false"/>
+                <w:color w:val="52514E"/>
+                <w:sz w:val="18"/>
+                <w:szCs w:val="18"/>
+              </w:rPr>
+              <w:t xml:space="preserve">Partnering with outside vendors — or some in-house</w:t>
+            </w:r>
+          </w:p>
+        </w:tc>
+        <w:tc>
+          <w:tcPr>
+            <w:tcW w:type="dxa" w:w="3504"/>
+            <w:tcBorders>
+              <w:top w:val="single" w:color="FFFFFF" w:sz="24"/>
+              <w:left w:val="single" w:color="FFFFFF" w:sz="24"/>
+              <w:bottom w:val="single" w:color="FFFFFF" w:sz="24"/>
+              <w:right w:val="single" w:color="FFFFFF" w:sz="24"/>
+            </w:tcBorders>
+            <w:shd w:fill="EEF2F8" w:color="auto" w:val="clear"/>
+            <w:tcMar>
+              <w:top w:type="dxa" w:w="120"/>
+              <w:left w:type="dxa" w:w="140"/>
+              <w:bottom w:type="dxa" w:w="120"/>
+              <w:right w:type="dxa" w:w="140"/>
+            </w:tcMar>
+          </w:tcPr>
+          <w:p>
+            <w:pPr>
+              <w:spacing w:after="60" w:before="0" w:line="264"/>
+              <w:jc w:val="left"/>
+            </w:pPr>
+            <w:r>
+              <w:rPr>
+                <w:rFonts w:ascii="Calibri" w:cs="Calibri" w:eastAsia="Calibri" w:hAnsi="Calibri"/>
+                <w:b/>
+                <w:bCs/>
+                <w:i w:val="false"/>
+                <w:iCs w:val="false"/>
+                <w:color w:val="2A78D6"/>
+                <w:sz w:val="21"/>
+                <w:szCs w:val="21"/>
+              </w:rPr>
+              <w:t xml:space="preserve">Owner not involved</w:t>
+            </w:r>
+          </w:p>
+          <w:p>
+            <w:pPr>
+              <w:spacing w:after="30" w:before="0" w:line="240"/>
+              <w:jc w:val="left"/>
+            </w:pPr>
+            <w:r>
+              <w:rPr>
+                <w:rFonts w:ascii="Calibri" w:cs="Calibri" w:eastAsia="Calibri" w:hAnsi="Calibri"/>
+                <w:b w:val="false"/>
+                <w:bCs w:val="false"/>
+                <w:i w:val="false"/>
+                <w:iCs w:val="false"/>
+                <w:color w:val="52514E"/>
+                <w:sz w:val="18"/>
+                <w:szCs w:val="18"/>
+              </w:rPr>
+              <w:t xml:space="preserve">Runs without them</w:t>
+            </w:r>
+          </w:p>
+        </w:tc>
+      </w:tr>
+    </w:tbl>
+    <w:p>
+      <w:pPr>
+        <w:pStyle w:val="Heading1"/>
+        <w:pBdr>
+          <w:bottom w:val="single" w:color="2A78D6" w:sz="12" w:space="4"/>
+        </w:pBdr>
+        <w:spacing w:after="20" w:before="240"/>
+      </w:pPr>
+      <w:r>
+        <w:rPr>
+          <w:rFonts w:ascii="Calibri" w:cs="Calibri" w:eastAsia="Calibri" w:hAnsi="Calibri"/>
+          <w:b/>
+          <w:bCs/>
+          <w:i w:val="false"/>
+          <w:iCs w:val="false"/>
+          <w:color w:val="2A78D6"/>
+          <w:sz w:val="30"/>
+          <w:szCs w:val="30"/>
+        </w:rPr>
+        <w:t xml:space="preserve">4. Events — the three numbers</w:t>
       </w:r>
     </w:p>
     <w:p>
@@ -1239,7 +1631,7 @@
           <w:sz w:val="30"/>
           <w:szCs w:val="30"/>
         </w:rPr>
-        <w:t xml:space="preserve">4. Revenue &amp; ancillary services</w:t>
+        <w:t xml:space="preserve">5. Revenue / Vendor Services</w:t>
       </w:r>
     </w:p>
     <w:p>
@@ -1261,44 +1653,327 @@
         <w:t xml:space="preserve">What they offer today · when we can implement · how fast we attach</w:t>
       </w:r>
     </w:p>
-    <w:p>
-      <w:pPr>
-        <w:spacing w:after="20" w:before="0" w:line="264"/>
-        <w:jc w:val="left"/>
-      </w:pPr>
-      <w:r>
-        <w:rPr>
-          <w:rFonts w:ascii="Calibri" w:cs="Calibri" w:eastAsia="Calibri" w:hAnsi="Calibri"/>
-          <w:b/>
-          <w:bCs/>
-          <w:i w:val="false"/>
-          <w:iCs w:val="false"/>
-          <w:color w:val="0B0B0B"/>
-          <w:sz w:val="20"/>
-          <w:szCs w:val="20"/>
-        </w:rPr>
-        <w:t xml:space="preserve">Today: in-house bar? Required caterer? What else do they offer, and how?</w:t>
-      </w:r>
-    </w:p>
-    <w:p>
-      <w:pPr>
-        <w:spacing w:after="80" w:before="0" w:line="264"/>
-        <w:jc w:val="left"/>
-      </w:pPr>
-      <w:r>
-        <w:rPr>
-          <w:rFonts w:ascii="Calibri" w:cs="Calibri" w:eastAsia="Calibri" w:hAnsi="Calibri"/>
-          <w:b/>
-          <w:bCs/>
-          <w:i w:val="false"/>
-          <w:iCs w:val="false"/>
-          <w:color w:val="0B0B0B"/>
-          <w:sz w:val="20"/>
-          <w:szCs w:val="20"/>
-        </w:rPr>
-        <w:t xml:space="preserve">Then: what can we implement, and when?</w:t>
-      </w:r>
-    </w:p>
+    <w:tbl>
+      <w:tblPr>
+        <w:tblW w:type="dxa" w:w="10512"/>
+        <w:tblBorders>
+          <w:top w:val="none" w:color="FFFFFF" w:sz="0"/>
+          <w:left w:val="none" w:color="FFFFFF" w:sz="0"/>
+          <w:bottom w:val="none" w:color="FFFFFF" w:sz="0"/>
+          <w:right w:val="none" w:color="FFFFFF" w:sz="0"/>
+          <w:insideH w:val="single" w:color="auto" w:sz="4"/>
+          <w:insideV w:val="single" w:color="auto" w:sz="4"/>
+        </w:tblBorders>
+      </w:tblPr>
+      <w:tblGrid>
+        <w:gridCol w:w="2900"/>
+        <w:gridCol w:w="7612"/>
+      </w:tblGrid>
+      <w:tr>
+        <w:tc>
+          <w:tcPr>
+            <w:tcW w:type="dxa" w:w="2900"/>
+            <w:tcBorders>
+              <w:top w:val="single" w:color="FFFFFF" w:sz="24"/>
+              <w:left w:val="single" w:color="FFFFFF" w:sz="24"/>
+              <w:bottom w:val="single" w:color="FFFFFF" w:sz="24"/>
+              <w:right w:val="single" w:color="FFFFFF" w:sz="24"/>
+            </w:tcBorders>
+            <w:shd w:fill="EEF2F8" w:color="auto" w:val="clear"/>
+            <w:tcMar>
+              <w:top w:type="dxa" w:w="80"/>
+              <w:left w:type="dxa" w:w="140"/>
+              <w:bottom w:type="dxa" w:w="80"/>
+              <w:right w:type="dxa" w:w="140"/>
+            </w:tcMar>
+          </w:tcPr>
+          <w:p>
+            <w:pPr>
+              <w:spacing w:after="0" w:before="0" w:line="264"/>
+              <w:jc w:val="left"/>
+            </w:pPr>
+            <w:r>
+              <w:rPr>
+                <w:rFonts w:ascii="Calibri" w:cs="Calibri" w:eastAsia="Calibri" w:hAnsi="Calibri"/>
+                <w:b/>
+                <w:bCs/>
+                <w:i w:val="false"/>
+                <w:iCs w:val="false"/>
+                <w:color w:val="2A78D6"/>
+                <w:sz w:val="20"/>
+                <w:szCs w:val="20"/>
+              </w:rPr>
+              <w:t xml:space="preserve">Photography · DJ · Stationery</w:t>
+            </w:r>
+          </w:p>
+        </w:tc>
+        <w:tc>
+          <w:tcPr>
+            <w:tcW w:type="dxa" w:w="7612"/>
+            <w:tcBorders>
+              <w:top w:val="single" w:color="FFFFFF" w:sz="24"/>
+              <w:left w:val="single" w:color="FFFFFF" w:sz="24"/>
+              <w:bottom w:val="single" w:color="FFFFFF" w:sz="24"/>
+              <w:right w:val="single" w:color="FFFFFF" w:sz="24"/>
+            </w:tcBorders>
+            <w:shd w:fill="F7F7F5" w:color="auto" w:val="clear"/>
+            <w:tcMar>
+              <w:top w:type="dxa" w:w="80"/>
+              <w:left w:type="dxa" w:w="140"/>
+              <w:bottom w:type="dxa" w:w="80"/>
+              <w:right w:type="dxa" w:w="140"/>
+            </w:tcMar>
+          </w:tcPr>
+          <w:p>
+            <w:pPr>
+              <w:spacing w:after="0" w:before="0" w:line="264"/>
+              <w:jc w:val="left"/>
+            </w:pPr>
+            <w:r>
+              <w:rPr>
+                <w:rFonts w:ascii="Calibri" w:cs="Calibri" w:eastAsia="Calibri" w:hAnsi="Calibri"/>
+                <w:b w:val="false"/>
+                <w:bCs w:val="false"/>
+                <w:i w:val="false"/>
+                <w:iCs w:val="false"/>
+                <w:color w:val="0B0B0B"/>
+                <w:sz w:val="20"/>
+                <w:szCs w:val="20"/>
+              </w:rPr>
+              <w:t xml:space="preserve">Quick to implement — set pricing and start selling.</w:t>
+            </w:r>
+          </w:p>
+        </w:tc>
+      </w:tr>
+      <w:tr>
+        <w:tc>
+          <w:tcPr>
+            <w:tcW w:type="dxa" w:w="2900"/>
+            <w:tcBorders>
+              <w:top w:val="single" w:color="FFFFFF" w:sz="24"/>
+              <w:left w:val="single" w:color="FFFFFF" w:sz="24"/>
+              <w:bottom w:val="single" w:color="FFFFFF" w:sz="24"/>
+              <w:right w:val="single" w:color="FFFFFF" w:sz="24"/>
+            </w:tcBorders>
+            <w:shd w:fill="EEF2F8" w:color="auto" w:val="clear"/>
+            <w:tcMar>
+              <w:top w:type="dxa" w:w="80"/>
+              <w:left w:type="dxa" w:w="140"/>
+              <w:bottom w:type="dxa" w:w="80"/>
+              <w:right w:type="dxa" w:w="140"/>
+            </w:tcMar>
+          </w:tcPr>
+          <w:p>
+            <w:pPr>
+              <w:spacing w:after="0" w:before="0" w:line="264"/>
+              <w:jc w:val="left"/>
+            </w:pPr>
+            <w:r>
+              <w:rPr>
+                <w:rFonts w:ascii="Calibri" w:cs="Calibri" w:eastAsia="Calibri" w:hAnsi="Calibri"/>
+                <w:b/>
+                <w:bCs/>
+                <w:i w:val="false"/>
+                <w:iCs w:val="false"/>
+                <w:color w:val="2A78D6"/>
+                <w:sz w:val="20"/>
+                <w:szCs w:val="20"/>
+              </w:rPr>
+              <w:t xml:space="preserve">Bar</w:t>
+            </w:r>
+          </w:p>
+        </w:tc>
+        <w:tc>
+          <w:tcPr>
+            <w:tcW w:type="dxa" w:w="7612"/>
+            <w:tcBorders>
+              <w:top w:val="single" w:color="FFFFFF" w:sz="24"/>
+              <w:left w:val="single" w:color="FFFFFF" w:sz="24"/>
+              <w:bottom w:val="single" w:color="FFFFFF" w:sz="24"/>
+              <w:right w:val="single" w:color="FFFFFF" w:sz="24"/>
+            </w:tcBorders>
+            <w:shd w:fill="F7F7F5" w:color="auto" w:val="clear"/>
+            <w:tcMar>
+              <w:top w:type="dxa" w:w="80"/>
+              <w:left w:type="dxa" w:w="140"/>
+              <w:bottom w:type="dxa" w:w="80"/>
+              <w:right w:type="dxa" w:w="140"/>
+            </w:tcMar>
+          </w:tcPr>
+          <w:p>
+            <w:pPr>
+              <w:spacing w:after="0" w:before="0" w:line="264"/>
+              <w:jc w:val="left"/>
+            </w:pPr>
+            <w:r>
+              <w:rPr>
+                <w:rFonts w:ascii="Calibri" w:cs="Calibri" w:eastAsia="Calibri" w:hAnsi="Calibri"/>
+                <w:b w:val="false"/>
+                <w:bCs w:val="false"/>
+                <w:i w:val="false"/>
+                <w:iCs w:val="false"/>
+                <w:color w:val="0B0B0B"/>
+                <w:sz w:val="20"/>
+                <w:szCs w:val="20"/>
+              </w:rPr>
+              <w:t xml:space="preserve">On/off switch. Off until we hold the liquor license, then on. Do they pour in-house today?</w:t>
+            </w:r>
+          </w:p>
+        </w:tc>
+      </w:tr>
+      <w:tr>
+        <w:tc>
+          <w:tcPr>
+            <w:tcW w:type="dxa" w:w="2900"/>
+            <w:tcBorders>
+              <w:top w:val="single" w:color="FFFFFF" w:sz="24"/>
+              <w:left w:val="single" w:color="FFFFFF" w:sz="24"/>
+              <w:bottom w:val="single" w:color="FFFFFF" w:sz="24"/>
+              <w:right w:val="single" w:color="FFFFFF" w:sz="24"/>
+            </w:tcBorders>
+            <w:shd w:fill="EEF2F8" w:color="auto" w:val="clear"/>
+            <w:tcMar>
+              <w:top w:type="dxa" w:w="80"/>
+              <w:left w:type="dxa" w:w="140"/>
+              <w:bottom w:type="dxa" w:w="80"/>
+              <w:right w:type="dxa" w:w="140"/>
+            </w:tcMar>
+          </w:tcPr>
+          <w:p>
+            <w:pPr>
+              <w:spacing w:after="0" w:before="0" w:line="264"/>
+              <w:jc w:val="left"/>
+            </w:pPr>
+            <w:r>
+              <w:rPr>
+                <w:rFonts w:ascii="Calibri" w:cs="Calibri" w:eastAsia="Calibri" w:hAnsi="Calibri"/>
+                <w:b/>
+                <w:bCs/>
+                <w:i w:val="false"/>
+                <w:iCs w:val="false"/>
+                <w:color w:val="2A78D6"/>
+                <w:sz w:val="20"/>
+                <w:szCs w:val="20"/>
+              </w:rPr>
+              <w:t xml:space="preserve">Catering</w:t>
+            </w:r>
+          </w:p>
+        </w:tc>
+        <w:tc>
+          <w:tcPr>
+            <w:tcW w:type="dxa" w:w="7612"/>
+            <w:tcBorders>
+              <w:top w:val="single" w:color="FFFFFF" w:sz="24"/>
+              <w:left w:val="single" w:color="FFFFFF" w:sz="24"/>
+              <w:bottom w:val="single" w:color="FFFFFF" w:sz="24"/>
+              <w:right w:val="single" w:color="FFFFFF" w:sz="24"/>
+            </w:tcBorders>
+            <w:shd w:fill="F7F7F5" w:color="auto" w:val="clear"/>
+            <w:tcMar>
+              <w:top w:type="dxa" w:w="80"/>
+              <w:left w:type="dxa" w:w="140"/>
+              <w:bottom w:type="dxa" w:w="80"/>
+              <w:right w:type="dxa" w:w="140"/>
+            </w:tcMar>
+          </w:tcPr>
+          <w:p>
+            <w:pPr>
+              <w:spacing w:after="0" w:before="0" w:line="264"/>
+              <w:jc w:val="left"/>
+            </w:pPr>
+            <w:r>
+              <w:rPr>
+                <w:rFonts w:ascii="Calibri" w:cs="Calibri" w:eastAsia="Calibri" w:hAnsi="Calibri"/>
+                <w:b w:val="false"/>
+                <w:bCs w:val="false"/>
+                <w:i w:val="false"/>
+                <w:iCs w:val="false"/>
+                <w:color w:val="0B0B0B"/>
+                <w:sz w:val="20"/>
+                <w:szCs w:val="20"/>
+              </w:rPr>
+              <w:t xml:space="preserve">Attach slowly — test, don't flip at close. Do they require a caterer today, even if not in-house?</w:t>
+            </w:r>
+          </w:p>
+        </w:tc>
+      </w:tr>
+      <w:tr>
+        <w:tc>
+          <w:tcPr>
+            <w:tcW w:type="dxa" w:w="2900"/>
+            <w:tcBorders>
+              <w:top w:val="single" w:color="FFFFFF" w:sz="24"/>
+              <w:left w:val="single" w:color="FFFFFF" w:sz="24"/>
+              <w:bottom w:val="single" w:color="FFFFFF" w:sz="24"/>
+              <w:right w:val="single" w:color="FFFFFF" w:sz="24"/>
+            </w:tcBorders>
+            <w:shd w:fill="EEF2F8" w:color="auto" w:val="clear"/>
+            <w:tcMar>
+              <w:top w:type="dxa" w:w="80"/>
+              <w:left w:type="dxa" w:w="140"/>
+              <w:bottom w:type="dxa" w:w="80"/>
+              <w:right w:type="dxa" w:w="140"/>
+            </w:tcMar>
+          </w:tcPr>
+          <w:p>
+            <w:pPr>
+              <w:spacing w:after="0" w:before="0" w:line="264"/>
+              <w:jc w:val="left"/>
+            </w:pPr>
+            <w:r>
+              <w:rPr>
+                <w:rFonts w:ascii="Calibri" w:cs="Calibri" w:eastAsia="Calibri" w:hAnsi="Calibri"/>
+                <w:b/>
+                <w:bCs/>
+                <w:i w:val="false"/>
+                <w:iCs w:val="false"/>
+                <w:color w:val="2A78D6"/>
+                <w:sz w:val="20"/>
+                <w:szCs w:val="20"/>
+              </w:rPr>
+              <w:t xml:space="preserve">Floral · Bakery</w:t>
+            </w:r>
+          </w:p>
+        </w:tc>
+        <w:tc>
+          <w:tcPr>
+            <w:tcW w:type="dxa" w:w="7612"/>
+            <w:tcBorders>
+              <w:top w:val="single" w:color="FFFFFF" w:sz="24"/>
+              <w:left w:val="single" w:color="FFFFFF" w:sz="24"/>
+              <w:bottom w:val="single" w:color="FFFFFF" w:sz="24"/>
+              <w:right w:val="single" w:color="FFFFFF" w:sz="24"/>
+            </w:tcBorders>
+            <w:shd w:fill="F7F7F5" w:color="auto" w:val="clear"/>
+            <w:tcMar>
+              <w:top w:type="dxa" w:w="80"/>
+              <w:left w:type="dxa" w:w="140"/>
+              <w:bottom w:type="dxa" w:w="80"/>
+              <w:right w:type="dxa" w:w="140"/>
+            </w:tcMar>
+          </w:tcPr>
+          <w:p>
+            <w:pPr>
+              <w:spacing w:after="0" w:before="0" w:line="264"/>
+              <w:jc w:val="left"/>
+            </w:pPr>
+            <w:r>
+              <w:rPr>
+                <w:rFonts w:ascii="Calibri" w:cs="Calibri" w:eastAsia="Calibri" w:hAnsi="Calibri"/>
+                <w:b w:val="false"/>
+                <w:bCs w:val="false"/>
+                <w:i w:val="false"/>
+                <w:iCs w:val="false"/>
+                <w:color w:val="0B0B0B"/>
+                <w:sz w:val="20"/>
+                <w:szCs w:val="20"/>
+              </w:rPr>
+              <w:t xml:space="preserve">Hub-dependent. Too far from The Olana → $0.</w:t>
+            </w:r>
+          </w:p>
+        </w:tc>
+      </w:tr>
+    </w:tbl>
     <w:p>
       <w:pPr>
         <w:spacing w:after="60" w:before="60"/>
@@ -1307,53 +1982,7 @@
       <w:r>
         <w:drawing>
           <wp:inline distT="0" distB="0" distL="0" distR="0">
-            <wp:extent cx="6038850" cy="1504950"/>
-            <wp:effectExtent t="0" r="0" b="0" l="0"/>
-            <wp:docPr id="1" name="" descr="" title=""/>
-            <wp:cNvGraphicFramePr>
-              <a:graphicFrameLocks xmlns:a="http://schemas.openxmlformats.org/drawingml/2006/main" noChangeAspect="1"/>
-            </wp:cNvGraphicFramePr>
-            <a:graphic xmlns:a="http://schemas.openxmlformats.org/drawingml/2006/main">
-              <a:graphicData uri="http://schemas.openxmlformats.org/drawingml/2006/picture">
-                <pic:pic xmlns:pic="http://schemas.openxmlformats.org/drawingml/2006/picture">
-                  <pic:nvPicPr>
-                    <pic:cNvPr id="0" name="" descr=""/>
-                    <pic:cNvPicPr>
-                      <a:picLocks noChangeAspect="1" noChangeArrowheads="1"/>
-                    </pic:cNvPicPr>
-                  </pic:nvPicPr>
-                  <pic:blipFill>
-                    <a:blip r:embed="rId8" cstate="none"/>
-                    <a:srcRect/>
-                    <a:stretch>
-                      <a:fillRect/>
-                    </a:stretch>
-                  </pic:blipFill>
-                  <pic:spPr bwMode="auto">
-                    <a:xfrm>
-                      <a:off x="0" y="0"/>
-                      <a:ext cx="6038850" cy="1504950"/>
-                    </a:xfrm>
-                    <a:prstGeom prst="rect">
-                      <a:avLst/>
-                    </a:prstGeom>
-                  </pic:spPr>
-                </pic:pic>
-              </a:graphicData>
-            </a:graphic>
-          </wp:inline>
-        </w:drawing>
-      </w:r>
-    </w:p>
-    <w:p>
-      <w:pPr>
-        <w:spacing w:after="60" w:before="60"/>
-        <w:jc w:val="center"/>
-      </w:pPr>
-      <w:r>
-        <w:drawing>
-          <wp:inline distT="0" distB="0" distL="0" distR="0">
-            <wp:extent cx="6038850" cy="2952750"/>
+            <wp:extent cx="4752975" cy="2324100"/>
             <wp:effectExtent t="0" r="0" b="0" l="0"/>
             <wp:docPr id="1" name="" descr="" title=""/>
             <wp:cNvGraphicFramePr>
@@ -1378,7 +2007,7 @@
                   <pic:spPr bwMode="auto">
                     <a:xfrm>
                       <a:off x="0" y="0"/>
-                      <a:ext cx="6038850" cy="2952750"/>
+                      <a:ext cx="4752975" cy="2324100"/>
                     </a:xfrm>
                     <a:prstGeom prst="rect">
                       <a:avLst/>
@@ -1404,13 +2033,13 @@
         </w:tblBorders>
       </w:tblPr>
       <w:tblGrid>
-        <w:gridCol w:w="2700"/>
-        <w:gridCol w:w="7812"/>
+        <w:gridCol w:w="2900"/>
+        <w:gridCol w:w="7612"/>
       </w:tblGrid>
       <w:tr>
         <w:tc>
           <w:tcPr>
-            <w:tcW w:type="dxa" w:w="2700"/>
+            <w:tcW w:type="dxa" w:w="2900"/>
             <w:tcBorders>
               <w:top w:val="single" w:color="FFFFFF" w:sz="24"/>
               <w:left w:val="single" w:color="FFFFFF" w:sz="24"/>
@@ -1441,13 +2070,13 @@
                 <w:sz w:val="20"/>
                 <w:szCs w:val="20"/>
               </w:rPr>
-              <w:t xml:space="preserve">Attachment rate</w:t>
-            </w:r>
-          </w:p>
-        </w:tc>
-        <w:tc>
-          <w:tcPr>
-            <w:tcW w:type="dxa" w:w="7812"/>
+              <w:t xml:space="preserve">Attachment ramp-up</w:t>
+            </w:r>
+          </w:p>
+        </w:tc>
+        <w:tc>
+          <w:tcPr>
+            <w:tcW w:type="dxa" w:w="7612"/>
             <w:tcBorders>
               <w:top w:val="single" w:color="FFFFFF" w:sz="24"/>
               <w:left w:val="single" w:color="FFFFFF" w:sz="24"/>
@@ -1478,7 +2107,7 @@
                 <w:sz w:val="20"/>
                 <w:szCs w:val="20"/>
               </w:rPr>
-              <w:t xml:space="preserve">Ramp up to the Walters average attachment for each service by Year 3. Tweak up or down for what they do today and what we truly believe we can do.</w:t>
+              <w:t xml:space="preserve">Ramp up to the Walters average attachment for each service by Year 3. Tweak for what they do today and what we truly believe we can do.</w:t>
             </w:r>
           </w:p>
         </w:tc>
@@ -1486,7 +2115,7 @@
       <w:tr>
         <w:tc>
           <w:tcPr>
-            <w:tcW w:type="dxa" w:w="2700"/>
+            <w:tcW w:type="dxa" w:w="2900"/>
             <w:tcBorders>
               <w:top w:val="single" w:color="FFFFFF" w:sz="24"/>
               <w:left w:val="single" w:color="FFFFFF" w:sz="24"/>
@@ -1517,13 +2146,13 @@
                 <w:sz w:val="20"/>
                 <w:szCs w:val="20"/>
               </w:rPr>
-              <w:t xml:space="preserve">$ per ancillary</w:t>
-            </w:r>
-          </w:p>
-        </w:tc>
-        <w:tc>
-          <w:tcPr>
-            <w:tcW w:type="dxa" w:w="7812"/>
+              <w:t xml:space="preserve">$ per vendor service</w:t>
+            </w:r>
+          </w:p>
+        </w:tc>
+        <w:tc>
+          <w:tcPr>
+            <w:tcW w:type="dxa" w:w="7612"/>
             <w:tcBorders>
               <w:top w:val="single" w:color="FFFFFF" w:sz="24"/>
               <w:left w:val="single" w:color="FFFFFF" w:sz="24"/>
@@ -1562,7 +2191,7 @@
       <w:tr>
         <w:tc>
           <w:tcPr>
-            <w:tcW w:type="dxa" w:w="2700"/>
+            <w:tcW w:type="dxa" w:w="2900"/>
             <w:tcBorders>
               <w:top w:val="single" w:color="FFFFFF" w:sz="24"/>
               <w:left w:val="single" w:color="FFFFFF" w:sz="24"/>
@@ -1599,7 +2228,7 @@
         </w:tc>
         <w:tc>
           <w:tcPr>
-            <w:tcW w:type="dxa" w:w="7812"/>
+            <w:tcW w:type="dxa" w:w="7612"/>
             <w:tcBorders>
               <w:top w:val="single" w:color="FFFFFF" w:sz="24"/>
               <w:left w:val="single" w:color="FFFFFF" w:sz="24"/>
@@ -1631,343 +2260,6 @@
                 <w:szCs w:val="20"/>
               </w:rPr>
               <w:t xml:space="preserve">Flipping every package to standard at close can lose the brides that venue attracts. Test and attach slowly — never assume catering is 100% on day one.</w:t>
-            </w:r>
-          </w:p>
-        </w:tc>
-      </w:tr>
-    </w:tbl>
-    <w:p>
-      <w:r>
-        <w:br w:type="page"/>
-      </w:r>
-    </w:p>
-    <w:p>
-      <w:pPr>
-        <w:pStyle w:val="Heading1"/>
-        <w:pBdr>
-          <w:bottom w:val="single" w:color="2A78D6" w:sz="12" w:space="4"/>
-        </w:pBdr>
-        <w:spacing w:after="20" w:before="240"/>
-      </w:pPr>
-      <w:r>
-        <w:rPr>
-          <w:rFonts w:ascii="Calibri" w:cs="Calibri" w:eastAsia="Calibri" w:hAnsi="Calibri"/>
-          <w:b/>
-          <w:bCs/>
-          <w:i w:val="false"/>
-          <w:iCs w:val="false"/>
-          <w:color w:val="2A78D6"/>
-          <w:sz w:val="30"/>
-          <w:szCs w:val="30"/>
-        </w:rPr>
-        <w:t xml:space="preserve">5. Current vs. new market</w:t>
-      </w:r>
-    </w:p>
-    <w:p>
-      <w:pPr>
-        <w:spacing w:after="100" w:before="0" w:line="264"/>
-        <w:jc w:val="left"/>
-      </w:pPr>
-      <w:r>
-        <w:rPr>
-          <w:rFonts w:ascii="Calibri" w:cs="Calibri" w:eastAsia="Calibri" w:hAnsi="Calibri"/>
-          <w:b w:val="false"/>
-          <w:bCs w:val="false"/>
-          <w:i/>
-          <w:iCs/>
-          <w:color w:val="52514E"/>
-          <w:sz w:val="18"/>
-          <w:szCs w:val="18"/>
-        </w:rPr>
-        <w:t xml:space="preserve">Current market = within 90 minutes of our hubs</w:t>
-      </w:r>
-    </w:p>
-    <w:p>
-      <w:pPr>
-        <w:spacing w:after="60" w:before="60"/>
-        <w:jc w:val="center"/>
-      </w:pPr>
-      <w:r>
-        <w:drawing>
-          <wp:inline distT="0" distB="0" distL="0" distR="0">
-            <wp:extent cx="5848350" cy="2171700"/>
-            <wp:effectExtent t="0" r="0" b="0" l="0"/>
-            <wp:docPr id="1" name="" descr="" title=""/>
-            <wp:cNvGraphicFramePr>
-              <a:graphicFrameLocks xmlns:a="http://schemas.openxmlformats.org/drawingml/2006/main" noChangeAspect="1"/>
-            </wp:cNvGraphicFramePr>
-            <a:graphic xmlns:a="http://schemas.openxmlformats.org/drawingml/2006/main">
-              <a:graphicData uri="http://schemas.openxmlformats.org/drawingml/2006/picture">
-                <pic:pic xmlns:pic="http://schemas.openxmlformats.org/drawingml/2006/picture">
-                  <pic:nvPicPr>
-                    <pic:cNvPr id="0" name="" descr=""/>
-                    <pic:cNvPicPr>
-                      <a:picLocks noChangeAspect="1" noChangeArrowheads="1"/>
-                    </pic:cNvPicPr>
-                  </pic:nvPicPr>
-                  <pic:blipFill>
-                    <a:blip r:embed="rId10" cstate="none"/>
-                    <a:srcRect/>
-                    <a:stretch>
-                      <a:fillRect/>
-                    </a:stretch>
-                  </pic:blipFill>
-                  <pic:spPr bwMode="auto">
-                    <a:xfrm>
-                      <a:off x="0" y="0"/>
-                      <a:ext cx="5848350" cy="2171700"/>
-                    </a:xfrm>
-                    <a:prstGeom prst="rect">
-                      <a:avLst/>
-                    </a:prstGeom>
-                  </pic:spPr>
-                </pic:pic>
-              </a:graphicData>
-            </a:graphic>
-          </wp:inline>
-        </w:drawing>
-      </w:r>
-    </w:p>
-    <w:tbl>
-      <w:tblPr>
-        <w:tblW w:type="dxa" w:w="10512"/>
-        <w:tblBorders>
-          <w:top w:val="none" w:color="FFFFFF" w:sz="0"/>
-          <w:left w:val="none" w:color="FFFFFF" w:sz="0"/>
-          <w:bottom w:val="none" w:color="FFFFFF" w:sz="0"/>
-          <w:right w:val="none" w:color="FFFFFF" w:sz="0"/>
-          <w:insideH w:val="single" w:color="auto" w:sz="4"/>
-          <w:insideV w:val="single" w:color="auto" w:sz="4"/>
-        </w:tblBorders>
-      </w:tblPr>
-      <w:tblGrid>
-        <w:gridCol w:w="2700"/>
-        <w:gridCol w:w="7812"/>
-      </w:tblGrid>
-      <w:tr>
-        <w:tc>
-          <w:tcPr>
-            <w:tcW w:type="dxa" w:w="2700"/>
-            <w:tcBorders>
-              <w:top w:val="single" w:color="FFFFFF" w:sz="24"/>
-              <w:left w:val="single" w:color="FFFFFF" w:sz="24"/>
-              <w:bottom w:val="single" w:color="FFFFFF" w:sz="24"/>
-              <w:right w:val="single" w:color="FFFFFF" w:sz="24"/>
-            </w:tcBorders>
-            <w:shd w:fill="EEF2F8" w:color="auto" w:val="clear"/>
-            <w:tcMar>
-              <w:top w:type="dxa" w:w="80"/>
-              <w:left w:type="dxa" w:w="140"/>
-              <w:bottom w:type="dxa" w:w="80"/>
-              <w:right w:type="dxa" w:w="140"/>
-            </w:tcMar>
-          </w:tcPr>
-          <w:p>
-            <w:pPr>
-              <w:spacing w:after="0" w:before="0" w:line="264"/>
-              <w:jc w:val="left"/>
-            </w:pPr>
-            <w:r>
-              <w:rPr>
-                <w:rFonts w:ascii="Calibri" w:cs="Calibri" w:eastAsia="Calibri" w:hAnsi="Calibri"/>
-                <w:b/>
-                <w:bCs/>
-                <w:i w:val="false"/>
-                <w:iCs w:val="false"/>
-                <w:color w:val="2A78D6"/>
-                <w:sz w:val="20"/>
-                <w:szCs w:val="20"/>
-              </w:rPr>
-              <w:t xml:space="preserve">Dallas hubs</w:t>
-            </w:r>
-          </w:p>
-        </w:tc>
-        <w:tc>
-          <w:tcPr>
-            <w:tcW w:type="dxa" w:w="7812"/>
-            <w:tcBorders>
-              <w:top w:val="single" w:color="FFFFFF" w:sz="24"/>
-              <w:left w:val="single" w:color="FFFFFF" w:sz="24"/>
-              <w:bottom w:val="single" w:color="FFFFFF" w:sz="24"/>
-              <w:right w:val="single" w:color="FFFFFF" w:sz="24"/>
-            </w:tcBorders>
-            <w:shd w:fill="F7F7F5" w:color="auto" w:val="clear"/>
-            <w:tcMar>
-              <w:top w:type="dxa" w:w="80"/>
-              <w:left w:type="dxa" w:w="140"/>
-              <w:bottom w:type="dxa" w:w="80"/>
-              <w:right w:type="dxa" w:w="140"/>
-            </w:tcMar>
-          </w:tcPr>
-          <w:p>
-            <w:pPr>
-              <w:spacing w:after="0" w:before="0" w:line="264"/>
-              <w:jc w:val="left"/>
-            </w:pPr>
-            <w:r>
-              <w:rPr>
-                <w:rFonts w:ascii="Calibri" w:cs="Calibri" w:eastAsia="Calibri" w:hAnsi="Calibri"/>
-                <w:b w:val="false"/>
-                <w:bCs w:val="false"/>
-                <w:i w:val="false"/>
-                <w:iCs w:val="false"/>
-                <w:color w:val="0B0B0B"/>
-                <w:sz w:val="20"/>
-                <w:szCs w:val="20"/>
-              </w:rPr>
-              <w:t xml:space="preserve">The Olana (bakery + floral) · one of our three catering hubs, whichever is closest</w:t>
-            </w:r>
-          </w:p>
-        </w:tc>
-      </w:tr>
-      <w:tr>
-        <w:tc>
-          <w:tcPr>
-            <w:tcW w:type="dxa" w:w="2700"/>
-            <w:tcBorders>
-              <w:top w:val="single" w:color="FFFFFF" w:sz="24"/>
-              <w:left w:val="single" w:color="FFFFFF" w:sz="24"/>
-              <w:bottom w:val="single" w:color="FFFFFF" w:sz="24"/>
-              <w:right w:val="single" w:color="FFFFFF" w:sz="24"/>
-            </w:tcBorders>
-            <w:shd w:fill="EEF2F8" w:color="auto" w:val="clear"/>
-            <w:tcMar>
-              <w:top w:type="dxa" w:w="80"/>
-              <w:left w:type="dxa" w:w="140"/>
-              <w:bottom w:type="dxa" w:w="80"/>
-              <w:right w:type="dxa" w:w="140"/>
-            </w:tcMar>
-          </w:tcPr>
-          <w:p>
-            <w:pPr>
-              <w:spacing w:after="0" w:before="0" w:line="264"/>
-              <w:jc w:val="left"/>
-            </w:pPr>
-            <w:r>
-              <w:rPr>
-                <w:rFonts w:ascii="Calibri" w:cs="Calibri" w:eastAsia="Calibri" w:hAnsi="Calibri"/>
-                <w:b/>
-                <w:bCs/>
-                <w:i w:val="false"/>
-                <w:iCs w:val="false"/>
-                <w:color w:val="2A78D6"/>
-                <w:sz w:val="20"/>
-                <w:szCs w:val="20"/>
-              </w:rPr>
-              <w:t xml:space="preserve">Rule</w:t>
-            </w:r>
-          </w:p>
-        </w:tc>
-        <w:tc>
-          <w:tcPr>
-            <w:tcW w:type="dxa" w:w="7812"/>
-            <w:tcBorders>
-              <w:top w:val="single" w:color="FFFFFF" w:sz="24"/>
-              <w:left w:val="single" w:color="FFFFFF" w:sz="24"/>
-              <w:bottom w:val="single" w:color="FFFFFF" w:sz="24"/>
-              <w:right w:val="single" w:color="FFFFFF" w:sz="24"/>
-            </w:tcBorders>
-            <w:shd w:fill="F7F7F5" w:color="auto" w:val="clear"/>
-            <w:tcMar>
-              <w:top w:type="dxa" w:w="80"/>
-              <w:left w:type="dxa" w:w="140"/>
-              <w:bottom w:type="dxa" w:w="80"/>
-              <w:right w:type="dxa" w:w="140"/>
-            </w:tcMar>
-          </w:tcPr>
-          <w:p>
-            <w:pPr>
-              <w:spacing w:after="0" w:before="0" w:line="264"/>
-              <w:jc w:val="left"/>
-            </w:pPr>
-            <w:r>
-              <w:rPr>
-                <w:rFonts w:ascii="Calibri" w:cs="Calibri" w:eastAsia="Calibri" w:hAnsi="Calibri"/>
-                <w:b w:val="false"/>
-                <w:bCs w:val="false"/>
-                <w:i w:val="false"/>
-                <w:iCs w:val="false"/>
-                <w:color w:val="0B0B0B"/>
-                <w:sz w:val="20"/>
-                <w:szCs w:val="20"/>
-              </w:rPr>
-              <w:t xml:space="preserve">Model each ancillary against its own hub. 30 min from catering but 1–2 hrs from bakery → catering yes, bakery $0.</w:t>
-            </w:r>
-          </w:p>
-        </w:tc>
-      </w:tr>
-      <w:tr>
-        <w:tc>
-          <w:tcPr>
-            <w:tcW w:type="dxa" w:w="2700"/>
-            <w:tcBorders>
-              <w:top w:val="single" w:color="FFFFFF" w:sz="24"/>
-              <w:left w:val="single" w:color="FFFFFF" w:sz="24"/>
-              <w:bottom w:val="single" w:color="FFFFFF" w:sz="24"/>
-              <w:right w:val="single" w:color="FFFFFF" w:sz="24"/>
-            </w:tcBorders>
-            <w:shd w:fill="EEF2F8" w:color="auto" w:val="clear"/>
-            <w:tcMar>
-              <w:top w:type="dxa" w:w="80"/>
-              <w:left w:type="dxa" w:w="140"/>
-              <w:bottom w:type="dxa" w:w="80"/>
-              <w:right w:type="dxa" w:w="140"/>
-            </w:tcMar>
-          </w:tcPr>
-          <w:p>
-            <w:pPr>
-              <w:spacing w:after="0" w:before="0" w:line="264"/>
-              <w:jc w:val="left"/>
-            </w:pPr>
-            <w:r>
-              <w:rPr>
-                <w:rFonts w:ascii="Calibri" w:cs="Calibri" w:eastAsia="Calibri" w:hAnsi="Calibri"/>
-                <w:b/>
-                <w:bCs/>
-                <w:i w:val="false"/>
-                <w:iCs w:val="false"/>
-                <w:color w:val="2A78D6"/>
-                <w:sz w:val="20"/>
-                <w:szCs w:val="20"/>
-              </w:rPr>
-              <w:t xml:space="preserve">New market</w:t>
-            </w:r>
-          </w:p>
-        </w:tc>
-        <w:tc>
-          <w:tcPr>
-            <w:tcW w:type="dxa" w:w="7812"/>
-            <w:tcBorders>
-              <w:top w:val="single" w:color="FFFFFF" w:sz="24"/>
-              <w:left w:val="single" w:color="FFFFFF" w:sz="24"/>
-              <w:bottom w:val="single" w:color="FFFFFF" w:sz="24"/>
-              <w:right w:val="single" w:color="FFFFFF" w:sz="24"/>
-            </w:tcBorders>
-            <w:shd w:fill="F7F7F5" w:color="auto" w:val="clear"/>
-            <w:tcMar>
-              <w:top w:type="dxa" w:w="80"/>
-              <w:left w:type="dxa" w:w="140"/>
-              <w:bottom w:type="dxa" w:w="80"/>
-              <w:right w:type="dxa" w:w="140"/>
-            </w:tcMar>
-          </w:tcPr>
-          <w:p>
-            <w:pPr>
-              <w:spacing w:after="0" w:before="0" w:line="264"/>
-              <w:jc w:val="left"/>
-            </w:pPr>
-            <w:r>
-              <w:rPr>
-                <w:rFonts w:ascii="Calibri" w:cs="Calibri" w:eastAsia="Calibri" w:hAnsi="Calibri"/>
-                <w:b w:val="false"/>
-                <w:bCs w:val="false"/>
-                <w:i w:val="false"/>
-                <w:iCs w:val="false"/>
-                <w:color w:val="0B0B0B"/>
-                <w:sz w:val="20"/>
-                <w:szCs w:val="20"/>
-              </w:rPr>
-              <w:t xml:space="preserve">Think further out. Needs to be a venue that already does well on its own; ancillaries may not come for a couple of years, once volume exists.</w:t>
             </w:r>
           </w:p>
         </w:tc>
@@ -2103,7 +2395,7 @@
                 <w:sz w:val="18"/>
                 <w:szCs w:val="18"/>
               </w:rPr>
-              <w:t xml:space="preserve">Add COGS for each ancillary we attach</w:t>
+              <w:t xml:space="preserve">Add COGS for each vendor service we attach</w:t>
             </w:r>
           </w:p>
           <w:p>
@@ -2216,7 +2508,7 @@
                 <w:sz w:val="18"/>
                 <w:szCs w:val="18"/>
               </w:rPr>
-              <w:t xml:space="preserve">Owner's pay and replacement cost → see 7</w:t>
+              <w:t xml:space="preserve">Owner: how involved today? What do they pay themselves? If they walk, who replaces them and at what cost?</w:t>
             </w:r>
           </w:p>
         </w:tc>
@@ -2311,221 +2603,6 @@
                 <w:szCs w:val="18"/>
               </w:rPr>
               <w:t xml:space="preserve">Adjust to how we'd run it post-close</w:t>
-            </w:r>
-          </w:p>
-        </w:tc>
-      </w:tr>
-    </w:tbl>
-    <w:p>
-      <w:pPr>
-        <w:spacing w:after="60" w:before="0"/>
-      </w:pPr>
-    </w:p>
-    <w:p>
-      <w:pPr>
-        <w:pStyle w:val="Heading1"/>
-        <w:pBdr>
-          <w:bottom w:val="single" w:color="2A78D6" w:sz="12" w:space="4"/>
-        </w:pBdr>
-        <w:spacing w:after="100" w:before="240"/>
-      </w:pPr>
-      <w:r>
-        <w:rPr>
-          <w:rFonts w:ascii="Calibri" w:cs="Calibri" w:eastAsia="Calibri" w:hAnsi="Calibri"/>
-          <w:b/>
-          <w:bCs/>
-          <w:i w:val="false"/>
-          <w:iCs w:val="false"/>
-          <w:color w:val="2A78D6"/>
-          <w:sz w:val="30"/>
-          <w:szCs w:val="30"/>
-        </w:rPr>
-        <w:t xml:space="preserve">7. The owner question</w:t>
-      </w:r>
-    </w:p>
-    <w:tbl>
-      <w:tblPr>
-        <w:tblW w:type="dxa" w:w="10512"/>
-        <w:tblBorders>
-          <w:top w:val="none" w:color="FFFFFF" w:sz="0"/>
-          <w:left w:val="none" w:color="FFFFFF" w:sz="0"/>
-          <w:bottom w:val="none" w:color="FFFFFF" w:sz="0"/>
-          <w:right w:val="none" w:color="FFFFFF" w:sz="0"/>
-          <w:insideH w:val="single" w:color="auto" w:sz="4"/>
-          <w:insideV w:val="single" w:color="auto" w:sz="4"/>
-        </w:tblBorders>
-      </w:tblPr>
-      <w:tblGrid>
-        <w:gridCol w:w="3504"/>
-        <w:gridCol w:w="3504"/>
-        <w:gridCol w:w="3504"/>
-      </w:tblGrid>
-      <w:tr>
-        <w:tc>
-          <w:tcPr>
-            <w:tcW w:type="dxa" w:w="3504"/>
-            <w:tcBorders>
-              <w:top w:val="single" w:color="FFFFFF" w:sz="24"/>
-              <w:left w:val="single" w:color="FFFFFF" w:sz="24"/>
-              <w:bottom w:val="single" w:color="FFFFFF" w:sz="24"/>
-              <w:right w:val="single" w:color="FFFFFF" w:sz="24"/>
-            </w:tcBorders>
-            <w:shd w:fill="F7F7F5" w:color="auto" w:val="clear"/>
-            <w:tcMar>
-              <w:top w:type="dxa" w:w="120"/>
-              <w:left w:type="dxa" w:w="140"/>
-              <w:bottom w:type="dxa" w:w="120"/>
-              <w:right w:type="dxa" w:w="140"/>
-            </w:tcMar>
-          </w:tcPr>
-          <w:p>
-            <w:pPr>
-              <w:spacing w:after="60" w:before="0" w:line="264"/>
-              <w:jc w:val="left"/>
-            </w:pPr>
-            <w:r>
-              <w:rPr>
-                <w:rFonts w:ascii="Calibri" w:cs="Calibri" w:eastAsia="Calibri" w:hAnsi="Calibri"/>
-                <w:b/>
-                <w:bCs/>
-                <w:i w:val="false"/>
-                <w:iCs w:val="false"/>
-                <w:color w:val="0B0B0B"/>
-                <w:sz w:val="20"/>
-                <w:szCs w:val="20"/>
-              </w:rPr>
-              <w:t xml:space="preserve">How involved are they today?</w:t>
-            </w:r>
-          </w:p>
-          <w:p>
-            <w:pPr>
-              <w:spacing w:after="30" w:before="0" w:line="240"/>
-              <w:jc w:val="left"/>
-            </w:pPr>
-            <w:r>
-              <w:rPr>
-                <w:rFonts w:ascii="Calibri" w:cs="Calibri" w:eastAsia="Calibri" w:hAnsi="Calibri"/>
-                <w:b w:val="false"/>
-                <w:bCs w:val="false"/>
-                <w:i w:val="false"/>
-                <w:iCs w:val="false"/>
-                <w:color w:val="52514E"/>
-                <w:sz w:val="18"/>
-                <w:szCs w:val="18"/>
-              </w:rPr>
-              <w:t xml:space="preserve">Day-to-day operations, sales, or both?</w:t>
-            </w:r>
-          </w:p>
-        </w:tc>
-        <w:tc>
-          <w:tcPr>
-            <w:tcW w:type="dxa" w:w="3504"/>
-            <w:tcBorders>
-              <w:top w:val="single" w:color="FFFFFF" w:sz="24"/>
-              <w:left w:val="single" w:color="FFFFFF" w:sz="24"/>
-              <w:bottom w:val="single" w:color="FFFFFF" w:sz="24"/>
-              <w:right w:val="single" w:color="FFFFFF" w:sz="24"/>
-            </w:tcBorders>
-            <w:shd w:fill="F7F7F5" w:color="auto" w:val="clear"/>
-            <w:tcMar>
-              <w:top w:type="dxa" w:w="120"/>
-              <w:left w:type="dxa" w:w="140"/>
-              <w:bottom w:type="dxa" w:w="120"/>
-              <w:right w:type="dxa" w:w="140"/>
-            </w:tcMar>
-          </w:tcPr>
-          <w:p>
-            <w:pPr>
-              <w:spacing w:after="60" w:before="0" w:line="264"/>
-              <w:jc w:val="left"/>
-            </w:pPr>
-            <w:r>
-              <w:rPr>
-                <w:rFonts w:ascii="Calibri" w:cs="Calibri" w:eastAsia="Calibri" w:hAnsi="Calibri"/>
-                <w:b/>
-                <w:bCs/>
-                <w:i w:val="false"/>
-                <w:iCs w:val="false"/>
-                <w:color w:val="0B0B0B"/>
-                <w:sz w:val="20"/>
-                <w:szCs w:val="20"/>
-              </w:rPr>
-              <w:t xml:space="preserve">What do they pay themselves?</w:t>
-            </w:r>
-          </w:p>
-          <w:p>
-            <w:pPr>
-              <w:spacing w:after="30" w:before="0" w:line="240"/>
-              <w:jc w:val="left"/>
-            </w:pPr>
-            <w:r>
-              <w:rPr>
-                <w:rFonts w:ascii="Calibri" w:cs="Calibri" w:eastAsia="Calibri" w:hAnsi="Calibri"/>
-                <w:b w:val="false"/>
-                <w:bCs w:val="false"/>
-                <w:i w:val="false"/>
-                <w:iCs w:val="false"/>
-                <w:color w:val="52514E"/>
-                <w:sz w:val="18"/>
-                <w:szCs w:val="18"/>
-              </w:rPr>
-              <w:t xml:space="preserve">Is it in payroll — or not?</w:t>
-            </w:r>
-          </w:p>
-        </w:tc>
-        <w:tc>
-          <w:tcPr>
-            <w:tcW w:type="dxa" w:w="3504"/>
-            <w:tcBorders>
-              <w:top w:val="single" w:color="FFFFFF" w:sz="24"/>
-              <w:left w:val="single" w:color="FFFFFF" w:sz="24"/>
-              <w:bottom w:val="single" w:color="FFFFFF" w:sz="24"/>
-              <w:right w:val="single" w:color="FFFFFF" w:sz="24"/>
-            </w:tcBorders>
-            <w:shd w:fill="F7F7F5" w:color="auto" w:val="clear"/>
-            <w:tcMar>
-              <w:top w:type="dxa" w:w="120"/>
-              <w:left w:type="dxa" w:w="140"/>
-              <w:bottom w:type="dxa" w:w="120"/>
-              <w:right w:type="dxa" w:w="140"/>
-            </w:tcMar>
-          </w:tcPr>
-          <w:p>
-            <w:pPr>
-              <w:spacing w:after="60" w:before="0" w:line="264"/>
-              <w:jc w:val="left"/>
-            </w:pPr>
-            <w:r>
-              <w:rPr>
-                <w:rFonts w:ascii="Calibri" w:cs="Calibri" w:eastAsia="Calibri" w:hAnsi="Calibri"/>
-                <w:b/>
-                <w:bCs/>
-                <w:i w:val="false"/>
-                <w:iCs w:val="false"/>
-                <w:color w:val="0B0B0B"/>
-                <w:sz w:val="20"/>
-                <w:szCs w:val="20"/>
-              </w:rPr>
-              <w:t xml:space="preserve">If they walk away…</w:t>
-            </w:r>
-          </w:p>
-          <w:p>
-            <w:pPr>
-              <w:spacing w:after="30" w:before="0" w:line="240"/>
-              <w:jc w:val="left"/>
-            </w:pPr>
-            <w:r>
-              <w:rPr>
-                <w:rFonts w:ascii="Calibri" w:cs="Calibri" w:eastAsia="Calibri" w:hAnsi="Calibri"/>
-                <w:b w:val="false"/>
-                <w:bCs w:val="false"/>
-                <w:i w:val="false"/>
-                <w:iCs w:val="false"/>
-                <w:color w:val="52514E"/>
-                <w:sz w:val="18"/>
-                <w:szCs w:val="18"/>
-              </w:rPr>
-              <w:t xml:space="preserve">Who replaces them, and at what cost?</w:t>
             </w:r>
           </w:p>
         </w:tc>

</xml_diff>